<commit_message>
Greek unified package: OKYpY letterhead, Greek template and document text
- Template follows the Greek layout: letterhead, title, subject, sections
  1-6, signature block and 'Σελίδα X από Y' footer.
- Script writes the document text in Greek (JSON summary and log stay in
  English), fills the new {{signature_block}}, and fills {{legal_basis}}
  inline next to its label. Block placeholders that share a line with a
  label now keep the label.
- CLAUDE.md updated to the revised instructions.

Co-Authored-By: Claude Opus 5.5 <noreply@anthropic.com>
Claude-Session: https://claude.ai/code/session_014C2RyTdzHRFwv531xZR3YZ
</commit_message>
<xml_diff>
--- a/templates/unified_template.docx
+++ b/templates/unified_template.docx
@@ -4,7 +4,7 @@
   <w:body>
     <w:p>
       <w:pPr>
-        <w:spacing w:after="60" w:before="0"/>
+        <w:spacing w:after="20" w:before="0"/>
         <w:jc w:val="center"/>
       </w:pPr>
       <w:r>
@@ -13,10 +13,27 @@
           <w:b/>
           <w:bCs/>
           <w:color w:val="1F4E79"/>
-          <w:sz w:val="36"/>
-          <w:szCs w:val="36"/>
-        </w:rPr>
-        <w:t xml:space="preserve">UNIFIED PROCUREMENT PACKAGE</w:t>
+          <w:sz w:val="24"/>
+          <w:szCs w:val="24"/>
+        </w:rPr>
+        <w:t xml:space="preserve">ΟΡΓΑΝΙΣΜΟΣ ΚΡΑΤΙΚΩΝ ΥΠΗΡΕΣΙΩΝ ΥΓΕΙΑΣ</w:t>
+      </w:r>
+    </w:p>
+    <w:p>
+      <w:pPr>
+        <w:spacing w:after="20" w:before="0"/>
+        <w:jc w:val="center"/>
+      </w:pPr>
+      <w:r>
+        <w:rPr>
+          <w:rFonts w:ascii="Calibri" w:cs="Calibri" w:eastAsia="Calibri" w:hAnsi="Calibri"/>
+          <w:b/>
+          <w:bCs/>
+          <w:color w:val="1F4E79"/>
+          <w:sz w:val="24"/>
+          <w:szCs w:val="24"/>
+        </w:rPr>
+        <w:t xml:space="preserve">ΓΕΝΙΚΟ ΝΟΣΟΚΟΜΕΙΟ ΛΕΜΕΣΟΥ</w:t>
       </w:r>
     </w:p>
     <w:p>
@@ -24,72 +41,148 @@
         <w:pBdr>
           <w:bottom w:val="single" w:color="1F4E79" w:sz="8" w:space="4"/>
         </w:pBdr>
-        <w:spacing w:after="240" w:before="0"/>
+        <w:spacing w:after="360" w:before="0"/>
         <w:jc w:val="center"/>
       </w:pPr>
       <w:r>
         <w:rPr>
           <w:rFonts w:ascii="Calibri" w:cs="Calibri" w:eastAsia="Calibri" w:hAnsi="Calibri"/>
-          <w:sz w:val="24"/>
-          <w:szCs w:val="24"/>
-        </w:rPr>
-        <w:t xml:space="preserve">Limassol General Hospital &amp; Troodos Hospital</w:t>
-      </w:r>
-    </w:p>
-    <w:p>
-      <w:pPr>
-        <w:spacing w:after="120" w:before="0"/>
-      </w:pPr>
-      <w:r>
-        <w:rPr>
-          <w:rFonts w:ascii="Calibri" w:cs="Calibri" w:eastAsia="Calibri" w:hAnsi="Calibri"/>
-          <w:sz w:val="22"/>
-          <w:szCs w:val="22"/>
-        </w:rPr>
-        <w:t xml:space="preserve">Supplier: {{supplier_name}}</w:t>
-      </w:r>
-    </w:p>
-    <w:p>
-      <w:pPr>
-        <w:spacing w:after="120" w:before="0"/>
-      </w:pPr>
-      <w:r>
-        <w:rPr>
-          <w:rFonts w:ascii="Calibri" w:cs="Calibri" w:eastAsia="Calibri" w:hAnsi="Calibri"/>
-          <w:sz w:val="22"/>
-          <w:szCs w:val="22"/>
-        </w:rPr>
-        <w:t xml:space="preserve">Date: {{date}}</w:t>
-      </w:r>
-    </w:p>
-    <w:p>
-      <w:pPr>
-        <w:spacing w:after="120" w:before="0"/>
-      </w:pPr>
-      <w:r>
-        <w:rPr>
-          <w:rFonts w:ascii="Calibri" w:cs="Calibri" w:eastAsia="Calibri" w:hAnsi="Calibri"/>
-          <w:sz w:val="22"/>
-          <w:szCs w:val="22"/>
-        </w:rPr>
-        <w:t xml:space="preserve">Kitchen: {{kitchen_name}}</w:t>
+          <w:sz w:val="20"/>
+          <w:szCs w:val="20"/>
+        </w:rPr>
+        <w:t xml:space="preserve">Τμήμα Αγορών και Προμηθειών | Διεύθυνση Λεμεσού – Πάφου</w:t>
+      </w:r>
+    </w:p>
+    <w:p>
+      <w:pPr>
+        <w:spacing w:after="60" w:before="0"/>
+        <w:jc w:val="center"/>
+      </w:pPr>
+      <w:r>
+        <w:rPr>
+          <w:rFonts w:ascii="Calibri" w:cs="Calibri" w:eastAsia="Calibri" w:hAnsi="Calibri"/>
+          <w:b/>
+          <w:bCs/>
+          <w:color w:val="1F4E79"/>
+          <w:sz w:val="32"/>
+          <w:szCs w:val="32"/>
+        </w:rPr>
+        <w:t xml:space="preserve">ΕΝΙΑΙΟ ΠΑΚΕΤΟ ΠΡΟΜΗΘΕΙΩΝ ΜΑΓΕΙΡΕΙΩΝ</w:t>
+      </w:r>
+    </w:p>
+    <w:p>
+      <w:pPr>
+        <w:spacing w:after="360" w:before="0"/>
+        <w:jc w:val="center"/>
+      </w:pPr>
+      <w:r>
+        <w:rPr>
+          <w:rFonts w:ascii="Calibri" w:cs="Calibri" w:eastAsia="Calibri" w:hAnsi="Calibri"/>
+          <w:sz w:val="24"/>
+          <w:szCs w:val="24"/>
+        </w:rPr>
+        <w:t xml:space="preserve">Γενικό Νοσοκομείο Λεμεσού &amp; Νοσοκομείο Τροόδους</w:t>
+      </w:r>
+    </w:p>
+    <w:p>
+      <w:pPr>
+        <w:spacing w:after="120" w:before="0"/>
+      </w:pPr>
+      <w:r>
+        <w:rPr>
+          <w:rFonts w:ascii="Calibri" w:cs="Calibri" w:eastAsia="Calibri" w:hAnsi="Calibri"/>
+          <w:b/>
+          <w:bCs/>
+          <w:sz w:val="22"/>
+          <w:szCs w:val="22"/>
+        </w:rPr>
+        <w:t xml:space="preserve">ΘΕΜΑ: Αυτοματοποιημένη Παραγγελία Τροφίμων</w:t>
       </w:r>
     </w:p>
     <w:p>
       <w:pPr>
         <w:keepNext/>
-        <w:spacing w:after="120" w:before="240"/>
-      </w:pPr>
-      <w:r>
-        <w:rPr>
-          <w:rFonts w:ascii="Calibri" w:cs="Calibri" w:eastAsia="Calibri" w:hAnsi="Calibri"/>
-          <w:b/>
-          <w:bCs/>
-          <w:color w:val="1F4E79"/>
-          <w:sz w:val="24"/>
-          <w:szCs w:val="24"/>
-        </w:rPr>
-        <w:t xml:space="preserve">Items Ordered:</w:t>
+        <w:spacing w:after="120" w:before="280"/>
+      </w:pPr>
+      <w:r>
+        <w:rPr>
+          <w:rFonts w:ascii="Calibri" w:cs="Calibri" w:eastAsia="Calibri" w:hAnsi="Calibri"/>
+          <w:b/>
+          <w:bCs/>
+          <w:color w:val="1F4E79"/>
+          <w:sz w:val="24"/>
+          <w:szCs w:val="24"/>
+        </w:rPr>
+        <w:t xml:space="preserve">1. Στοιχεία Παραγγελίας</w:t>
+      </w:r>
+    </w:p>
+    <w:p>
+      <w:pPr>
+        <w:spacing w:after="120" w:before="0"/>
+      </w:pPr>
+      <w:r>
+        <w:rPr>
+          <w:rFonts w:ascii="Calibri" w:cs="Calibri" w:eastAsia="Calibri" w:hAnsi="Calibri"/>
+          <w:sz w:val="22"/>
+          <w:szCs w:val="22"/>
+        </w:rPr>
+        <w:t xml:space="preserve">Ημερομηνία: {{date}}</w:t>
+      </w:r>
+    </w:p>
+    <w:p>
+      <w:pPr>
+        <w:spacing w:after="120" w:before="0"/>
+      </w:pPr>
+      <w:r>
+        <w:rPr>
+          <w:rFonts w:ascii="Calibri" w:cs="Calibri" w:eastAsia="Calibri" w:hAnsi="Calibri"/>
+          <w:sz w:val="22"/>
+          <w:szCs w:val="22"/>
+        </w:rPr>
+        <w:t xml:space="preserve">Νοσοκομείο: {{kitchen_name}}</w:t>
+      </w:r>
+    </w:p>
+    <w:p>
+      <w:pPr>
+        <w:spacing w:after="120" w:before="0"/>
+      </w:pPr>
+      <w:r>
+        <w:rPr>
+          <w:rFonts w:ascii="Calibri" w:cs="Calibri" w:eastAsia="Calibri" w:hAnsi="Calibri"/>
+          <w:sz w:val="22"/>
+          <w:szCs w:val="22"/>
+        </w:rPr>
+        <w:t xml:space="preserve">Προμηθευτής: {{supplier_name}}</w:t>
+      </w:r>
+    </w:p>
+    <w:p>
+      <w:pPr>
+        <w:spacing w:after="120" w:before="0"/>
+      </w:pPr>
+      <w:r>
+        <w:rPr>
+          <w:rFonts w:ascii="Calibri" w:cs="Calibri" w:eastAsia="Calibri" w:hAnsi="Calibri"/>
+          <w:sz w:val="22"/>
+          <w:szCs w:val="22"/>
+        </w:rPr>
+        <w:t xml:space="preserve">Νομική Βάση: {{legal_basis}}</w:t>
+      </w:r>
+    </w:p>
+    <w:p>
+      <w:pPr>
+        <w:keepNext/>
+        <w:spacing w:after="120" w:before="280"/>
+      </w:pPr>
+      <w:r>
+        <w:rPr>
+          <w:rFonts w:ascii="Calibri" w:cs="Calibri" w:eastAsia="Calibri" w:hAnsi="Calibri"/>
+          <w:b/>
+          <w:bCs/>
+          <w:color w:val="1F4E79"/>
+          <w:sz w:val="24"/>
+          <w:szCs w:val="24"/>
+        </w:rPr>
+        <w:t xml:space="preserve">2. Πίνακας Ειδών</w:t>
       </w:r>
     </w:p>
     <w:p>
@@ -108,18 +201,18 @@
     <w:p>
       <w:pPr>
         <w:keepNext/>
-        <w:spacing w:after="120" w:before="240"/>
-      </w:pPr>
-      <w:r>
-        <w:rPr>
-          <w:rFonts w:ascii="Calibri" w:cs="Calibri" w:eastAsia="Calibri" w:hAnsi="Calibri"/>
-          <w:b/>
-          <w:bCs/>
-          <w:color w:val="1F4E79"/>
-          <w:sz w:val="24"/>
-          <w:szCs w:val="24"/>
-        </w:rPr>
-        <w:t xml:space="preserve">Price Comparison:</w:t>
+        <w:spacing w:after="120" w:before="280"/>
+      </w:pPr>
+      <w:r>
+        <w:rPr>
+          <w:rFonts w:ascii="Calibri" w:cs="Calibri" w:eastAsia="Calibri" w:hAnsi="Calibri"/>
+          <w:b/>
+          <w:bCs/>
+          <w:color w:val="1F4E79"/>
+          <w:sz w:val="24"/>
+          <w:szCs w:val="24"/>
+        </w:rPr>
+        <w:t xml:space="preserve">3. Συγκριτικός Πίνακας Τιμών</w:t>
       </w:r>
     </w:p>
     <w:p>
@@ -138,167 +231,124 @@
     <w:p>
       <w:pPr>
         <w:keepNext/>
-        <w:spacing w:after="120" w:before="240"/>
-      </w:pPr>
-      <w:r>
-        <w:rPr>
-          <w:rFonts w:ascii="Calibri" w:cs="Calibri" w:eastAsia="Calibri" w:hAnsi="Calibri"/>
-          <w:b/>
-          <w:bCs/>
-          <w:color w:val="1F4E79"/>
-          <w:sz w:val="24"/>
-          <w:szCs w:val="24"/>
-        </w:rPr>
-        <w:t xml:space="preserve">Legal Basis:</w:t>
-      </w:r>
-    </w:p>
-    <w:p>
-      <w:pPr>
-        <w:spacing w:after="120" w:before="0"/>
-      </w:pPr>
-      <w:r>
-        <w:rPr>
-          <w:rFonts w:ascii="Calibri" w:cs="Calibri" w:eastAsia="Calibri" w:hAnsi="Calibri"/>
-          <w:sz w:val="22"/>
-          <w:szCs w:val="22"/>
-        </w:rPr>
-        <w:t xml:space="preserve">{{legal_basis}}</w:t>
+        <w:spacing w:after="120" w:before="280"/>
+      </w:pPr>
+      <w:r>
+        <w:rPr>
+          <w:rFonts w:ascii="Calibri" w:cs="Calibri" w:eastAsia="Calibri" w:hAnsi="Calibri"/>
+          <w:b/>
+          <w:bCs/>
+          <w:color w:val="1F4E79"/>
+          <w:sz w:val="24"/>
+          <w:szCs w:val="24"/>
+        </w:rPr>
+        <w:t xml:space="preserve">4. Απόφαση</w:t>
+      </w:r>
+    </w:p>
+    <w:p>
+      <w:pPr>
+        <w:spacing w:after="120" w:before="0"/>
+      </w:pPr>
+      <w:r>
+        <w:rPr>
+          <w:rFonts w:ascii="Calibri" w:cs="Calibri" w:eastAsia="Calibri" w:hAnsi="Calibri"/>
+          <w:sz w:val="22"/>
+          <w:szCs w:val="22"/>
+        </w:rPr>
+        <w:t xml:space="preserve">{{decision_text}}</w:t>
       </w:r>
     </w:p>
     <w:p>
       <w:pPr>
         <w:keepNext/>
-        <w:spacing w:after="120" w:before="240"/>
-      </w:pPr>
-      <w:r>
-        <w:rPr>
-          <w:rFonts w:ascii="Calibri" w:cs="Calibri" w:eastAsia="Calibri" w:hAnsi="Calibri"/>
-          <w:b/>
-          <w:bCs/>
-          <w:color w:val="1F4E79"/>
-          <w:sz w:val="24"/>
-          <w:szCs w:val="24"/>
-        </w:rPr>
-        <w:t xml:space="preserve">Decision:</w:t>
-      </w:r>
-    </w:p>
-    <w:p>
-      <w:pPr>
-        <w:spacing w:after="120" w:before="0"/>
-      </w:pPr>
-      <w:r>
-        <w:rPr>
-          <w:rFonts w:ascii="Calibri" w:cs="Calibri" w:eastAsia="Calibri" w:hAnsi="Calibri"/>
-          <w:sz w:val="22"/>
-          <w:szCs w:val="22"/>
-        </w:rPr>
-        <w:t xml:space="preserve">{{decision_text}}</w:t>
+        <w:spacing w:after="120" w:before="280"/>
+      </w:pPr>
+      <w:r>
+        <w:rPr>
+          <w:rFonts w:ascii="Calibri" w:cs="Calibri" w:eastAsia="Calibri" w:hAnsi="Calibri"/>
+          <w:b/>
+          <w:bCs/>
+          <w:color w:val="1F4E79"/>
+          <w:sz w:val="24"/>
+          <w:szCs w:val="24"/>
+        </w:rPr>
+        <w:t xml:space="preserve">5. Αποδοχή ή Ανάθεση</w:t>
+      </w:r>
+    </w:p>
+    <w:p>
+      <w:pPr>
+        <w:spacing w:after="120" w:before="0"/>
+      </w:pPr>
+      <w:r>
+        <w:rPr>
+          <w:rFonts w:ascii="Calibri" w:cs="Calibri" w:eastAsia="Calibri" w:hAnsi="Calibri"/>
+          <w:sz w:val="22"/>
+          <w:szCs w:val="22"/>
+        </w:rPr>
+        <w:t xml:space="preserve">{{acceptance_or_award_text}}</w:t>
       </w:r>
     </w:p>
     <w:p>
       <w:pPr>
         <w:keepNext/>
-        <w:spacing w:after="120" w:before="240"/>
-      </w:pPr>
-      <w:r>
-        <w:rPr>
-          <w:rFonts w:ascii="Calibri" w:cs="Calibri" w:eastAsia="Calibri" w:hAnsi="Calibri"/>
-          <w:b/>
-          <w:bCs/>
-          <w:color w:val="1F4E79"/>
-          <w:sz w:val="24"/>
-          <w:szCs w:val="24"/>
-        </w:rPr>
-        <w:t xml:space="preserve">Acceptance or Award:</w:t>
-      </w:r>
-    </w:p>
-    <w:p>
-      <w:pPr>
-        <w:spacing w:after="120" w:before="0"/>
-      </w:pPr>
-      <w:r>
-        <w:rPr>
-          <w:rFonts w:ascii="Calibri" w:cs="Calibri" w:eastAsia="Calibri" w:hAnsi="Calibri"/>
-          <w:sz w:val="22"/>
-          <w:szCs w:val="22"/>
-        </w:rPr>
-        <w:t xml:space="preserve">{{acceptance_or_award_text}}</w:t>
+        <w:spacing w:after="120" w:before="280"/>
+      </w:pPr>
+      <w:r>
+        <w:rPr>
+          <w:rFonts w:ascii="Calibri" w:cs="Calibri" w:eastAsia="Calibri" w:hAnsi="Calibri"/>
+          <w:b/>
+          <w:bCs/>
+          <w:color w:val="1F4E79"/>
+          <w:sz w:val="24"/>
+          <w:szCs w:val="24"/>
+        </w:rPr>
+        <w:t xml:space="preserve">6. Τελική Παραγγελία</w:t>
+      </w:r>
+    </w:p>
+    <w:p>
+      <w:pPr>
+        <w:spacing w:after="120" w:before="0"/>
+      </w:pPr>
+      <w:r>
+        <w:rPr>
+          <w:rFonts w:ascii="Calibri" w:cs="Calibri" w:eastAsia="Calibri" w:hAnsi="Calibri"/>
+          <w:sz w:val="22"/>
+          <w:szCs w:val="22"/>
+        </w:rPr>
+        <w:t xml:space="preserve">{{final_order_text}}</w:t>
       </w:r>
     </w:p>
     <w:p>
       <w:pPr>
         <w:keepNext/>
-        <w:spacing w:after="120" w:before="240"/>
-      </w:pPr>
-      <w:r>
-        <w:rPr>
-          <w:rFonts w:ascii="Calibri" w:cs="Calibri" w:eastAsia="Calibri" w:hAnsi="Calibri"/>
-          <w:b/>
-          <w:bCs/>
-          <w:color w:val="1F4E79"/>
-          <w:sz w:val="24"/>
-          <w:szCs w:val="24"/>
-        </w:rPr>
-        <w:t xml:space="preserve">Final Order:</w:t>
-      </w:r>
-    </w:p>
-    <w:p>
-      <w:pPr>
-        <w:spacing w:after="120" w:before="0"/>
-      </w:pPr>
-      <w:r>
-        <w:rPr>
-          <w:rFonts w:ascii="Calibri" w:cs="Calibri" w:eastAsia="Calibri" w:hAnsi="Calibri"/>
-          <w:sz w:val="22"/>
-          <w:szCs w:val="22"/>
-        </w:rPr>
-        <w:t xml:space="preserve">{{final_order_text}}</w:t>
-      </w:r>
-    </w:p>
-    <w:p>
-      <w:pPr>
-        <w:keepNext/>
-        <w:spacing w:after="120" w:before="240"/>
-      </w:pPr>
-      <w:r>
-        <w:rPr>
-          <w:rFonts w:ascii="Calibri" w:cs="Calibri" w:eastAsia="Calibri" w:hAnsi="Calibri"/>
-          <w:b/>
-          <w:bCs/>
-          <w:color w:val="1F4E79"/>
-          <w:sz w:val="24"/>
-          <w:szCs w:val="24"/>
-        </w:rPr>
-        <w:t xml:space="preserve">Signature:</w:t>
-      </w:r>
-    </w:p>
-    <w:p>
-      <w:pPr>
-        <w:spacing w:after="600" w:before="0"/>
-      </w:pPr>
-      <w:r>
-        <w:rPr>
-          <w:rFonts w:ascii="Calibri" w:cs="Calibri" w:eastAsia="Calibri" w:hAnsi="Calibri"/>
-          <w:sz w:val="22"/>
-          <w:szCs w:val="22"/>
-        </w:rPr>
-        <w:t xml:space="preserve">Procurement Office</w:t>
-      </w:r>
-    </w:p>
-    <w:p>
-      <w:pPr>
-        <w:spacing w:after="120" w:before="0"/>
-      </w:pPr>
-      <w:r>
-        <w:rPr>
-          <w:rFonts w:ascii="Calibri" w:cs="Calibri" w:eastAsia="Calibri" w:hAnsi="Calibri"/>
-          <w:sz w:val="22"/>
-          <w:szCs w:val="22"/>
-        </w:rPr>
-        <w:t xml:space="preserve">______________________________</w:t>
+        <w:spacing w:after="240" w:before="360"/>
+      </w:pPr>
+      <w:r>
+        <w:rPr>
+          <w:rFonts w:ascii="Calibri" w:cs="Calibri" w:eastAsia="Calibri" w:hAnsi="Calibri"/>
+          <w:b/>
+          <w:bCs/>
+          <w:sz w:val="22"/>
+          <w:szCs w:val="22"/>
+        </w:rPr>
+        <w:t xml:space="preserve">Για το Τμήμα Αγορών &amp; Προμηθειών</w:t>
+      </w:r>
+    </w:p>
+    <w:p>
+      <w:pPr>
+        <w:spacing w:after="120" w:before="0"/>
+      </w:pPr>
+      <w:r>
+        <w:rPr>
+          <w:rFonts w:ascii="Calibri" w:cs="Calibri" w:eastAsia="Calibri" w:hAnsi="Calibri"/>
+          <w:sz w:val="22"/>
+          <w:szCs w:val="22"/>
+        </w:rPr>
+        <w:t xml:space="preserve">{{signature_block}}</w:t>
       </w:r>
     </w:p>
     <w:sectPr>
+      <w:footerReference w:type="default" r:id="rId7"/>
       <w:pgSz w:w="11906" w:h="16838" w:orient="portrait"/>
       <w:pgMar w:top="1440" w:right="1440" w:bottom="1440" w:left="1440" w:header="708" w:footer="708" w:gutter="0"/>
       <w:pgNumType/>
@@ -347,6 +397,58 @@
     </w:p>
   </w:endnote>
 </w:endnotes>
+</file>
+
+<file path=word/footer1.xml><?xml version="1.0" encoding="utf-8"?>
+<w:ftr xmlns:wpc="http://schemas.microsoft.com/office/word/2010/wordprocessingCanvas" xmlns:mc="http://schemas.openxmlformats.org/markup-compatibility/2006" xmlns:o="urn:schemas-microsoft-com:office:office" xmlns:r="http://schemas.openxmlformats.org/officeDocument/2006/relationships" xmlns:m="http://schemas.openxmlformats.org/officeDocument/2006/math" xmlns:v="urn:schemas-microsoft-com:vml" xmlns:wp14="http://schemas.microsoft.com/office/word/2010/wordprocessingDrawing" xmlns:wp="http://schemas.openxmlformats.org/drawingml/2006/wordprocessingDrawing" xmlns:w10="urn:schemas-microsoft-com:office:word" xmlns:w="http://schemas.openxmlformats.org/wordprocessingml/2006/main" xmlns:w14="http://schemas.microsoft.com/office/word/2010/wordml" xmlns:w15="http://schemas.microsoft.com/office/word/2012/wordml" xmlns:wpg="http://schemas.microsoft.com/office/word/2010/wordprocessingGroup" xmlns:wpi="http://schemas.microsoft.com/office/word/2010/wordprocessingInk" xmlns:wne="http://schemas.microsoft.com/office/word/2006/wordml" xmlns:wps="http://schemas.microsoft.com/office/word/2010/wordprocessingShape">
+  <w:p>
+    <w:pPr>
+      <w:jc w:val="center"/>
+    </w:pPr>
+    <w:r>
+      <w:rPr>
+        <w:rFonts w:ascii="Calibri" w:cs="Calibri" w:eastAsia="Calibri" w:hAnsi="Calibri"/>
+        <w:color w:val="666666"/>
+        <w:sz w:val="18"/>
+        <w:szCs w:val="18"/>
+      </w:rPr>
+      <w:t xml:space="preserve">Σελίδα </w:t>
+    </w:r>
+    <w:r>
+      <w:rPr>
+        <w:rFonts w:ascii="Calibri" w:cs="Calibri" w:eastAsia="Calibri" w:hAnsi="Calibri"/>
+        <w:color w:val="666666"/>
+        <w:sz w:val="18"/>
+        <w:szCs w:val="18"/>
+      </w:rPr>
+      <w:fldChar w:fldCharType="begin"/>
+      <w:instrText xml:space="preserve">PAGE</w:instrText>
+      <w:fldChar w:fldCharType="separate"/>
+      <w:fldChar w:fldCharType="end"/>
+    </w:r>
+    <w:r>
+      <w:rPr>
+        <w:rFonts w:ascii="Calibri" w:cs="Calibri" w:eastAsia="Calibri" w:hAnsi="Calibri"/>
+        <w:color w:val="666666"/>
+        <w:sz w:val="18"/>
+        <w:szCs w:val="18"/>
+      </w:rPr>
+      <w:t xml:space="preserve"> από </w:t>
+    </w:r>
+    <w:r>
+      <w:rPr>
+        <w:rFonts w:ascii="Calibri" w:cs="Calibri" w:eastAsia="Calibri" w:hAnsi="Calibri"/>
+        <w:color w:val="666666"/>
+        <w:sz w:val="18"/>
+        <w:szCs w:val="18"/>
+      </w:rPr>
+      <w:fldChar w:fldCharType="begin"/>
+      <w:instrText xml:space="preserve">NUMPAGES</w:instrText>
+      <w:fldChar w:fldCharType="separate"/>
+      <w:fldChar w:fldCharType="end"/>
+    </w:r>
+  </w:p>
+</w:ftr>
 </file>
 
 <file path=word/footnotes.xml><?xml version="1.0" encoding="utf-8"?>

</xml_diff>